<commit_message>
report updates on data leakage
</commit_message>
<xml_diff>
--- a/oit367_final_report.docx
+++ b/oit367_final_report.docx
@@ -4479,7 +4479,61 @@
           <w:sz w:val="20"/>
           <w:szCs w:val="20"/>
         </w:rPr>
-        <w:t xml:space="preserve">Several limitations reflect data constraints encountered during the study. First, Spotify's Developer Mode rate limit prevented full API-based artist feature collection for non-charted tracks. The workaround was to scrape only the 953 unique charted artists via the Spotify API and rely on the MusicBrainz/Last.fm dataset for the non-charted universe. This creates an asymmetry: charted-artist features derive from a clean Spotify API pull, while non-charted artists' values come from a separate third-party database joined on fuzzy artist-name matching (65.8% match rate). Any systematic quality gap between these two sources could bias artist-feature coefficients upward, and a production-quality study would use a single source or apply explicit bias corrections. Second, five artist demographic and label features available in the dataset — is_male_artist, artist_age, is_mainstream_genre, artist_scrobbles_log, and artist_listeners_monthly_log — were excluded from all models. The first three were populated for only approximately 58% of the 2,157 charted tracks and essentially 0% of the 76,233 non-charted tracks, making model inclusion without substantial imputation methodologically unsound. The latter two were collinear with lastfm_listeners_log at VIF values exceeding 600. A study designed specifically around artist demographics would require universe-level coverage from the outset. Third, the two Spotify artist popularity metrics (artist_peak_popularity and artist_popularity_api, VIF &gt; 14) are highly collinear, making individual coefficient signs unreliable; only their combined directional signal is interpretable. Fourth, lyric sentiment covers only 40.1% of charted tracks (n = 856), as the Billboard lyrics dataset ends in 2022 and excludes tracks with missing or unparseable lyrics, constraining the longevity model sample and reducing statistical power for sentiment findings. Fifth, four covariates fail the Schoenfeld proportional hazards test (Appendix B), meaning Cox hazard ratios for decade_idx, acousticness, duration, and sentiment_pos should be interpreted with caution. All reported associations are observational and should not be interpreted causally.</w:t>
+        <w:t xml:space="preserve">The most significant methodological limitation is temporal feature misalignment in the artist-level predictors. The three Spotify API features — artist_peak_popularity, artist_popularity_api, and artist_track_count — were scraped in early 2026 and reflect each artist's career through that date. The Last.fm listener count (lastfm_listeners_log) comes from a dataset published circa 2020. Both are applied as static features to chart events spanning 1958 to 2024. For a track that charted in 1975, the model therefore has access to information about that artist's career trajectory through 2026 when predicting whether the 1975 track charted — information that was not available at the time. If an artist had modest commercial standing in 1975 but became globally prominent by 2000, the model uses their 2026 peak popularity to retroactively explain their 1975 chart entry. This is a form of temporal data leakage that inflates the apparent predictive contribution of artist features and is one reason the artist enrichment lift (16-fold PR-AUC improvement over audio-only) should be interpreted as an upper bound rather than a point estimate of prospective performance.</w:t>
+      </w:r>
+    </w:p>
+    <w:p>
+      <w:pPr>
+        <w:spacing w:after="80" w:before="80"/>
+        <w:jc w:val="left"/>
+      </w:pPr>
+      <w:r>
+        <w:rPr>
+          <w:rFonts w:ascii="Arial" w:cs="Arial" w:eastAsia="Arial" w:hAnsi="Arial"/>
+          <w:b w:val="false"/>
+          <w:bCs w:val="false"/>
+          <w:i w:val="false"/>
+          <w:iCs w:val="false"/>
+          <w:sz w:val="20"/>
+          <w:szCs w:val="20"/>
+        </w:rPr>
+        <w:t xml:space="preserve">A related issue is artist-level correlation across the random train/test split. Because artist features are single values per artist that do not vary across tracks, every track by the same artist carries identical feature values. A random 80/20 split places multiple tracks from the same artist in both training and test partitions. The model can effectively learn per-artist decision boundaries in training and reproduce them at test time without genuinely generalizing to unseen artists. This inflates holdout metrics beyond what would be observed for a deployment scenario involving artists not previously seen by the model — again, precisely the highest-value use case for an A&amp;R screening tool.</w:t>
+      </w:r>
+    </w:p>
+    <w:p>
+      <w:pPr>
+        <w:spacing w:after="80" w:before="80"/>
+        <w:jc w:val="left"/>
+      </w:pPr>
+      <w:r>
+        <w:rPr>
+          <w:rFonts w:ascii="Arial" w:cs="Arial" w:eastAsia="Arial" w:hAnsi="Arial"/>
+          <w:b w:val="false"/>
+          <w:bCs w:val="false"/>
+          <w:i w:val="false"/>
+          <w:iCs w:val="false"/>
+          <w:sz w:val="20"/>
+          <w:szCs w:val="20"/>
+        </w:rPr>
+        <w:t xml:space="preserve">The degree of practical impact from these two issues depends on the deployment context. For A&amp;R screening of tracks by established artists with existing Spotify and Last.fm presence, artist_popularity_api and lastfm_listeners_log are legitimately available at prediction time, and the temporal misalignment is less severe because established artists' current and historical popularity are strongly correlated. The concern is highest for genuinely emerging artists — those with little or no prior commercial history — where current-era popularity scores carry no valid predictive signal and per-artist memorization cannot occur. A production deployment would require point-in-time artist feature reconstruction (indexing popularity scores to the date of each chart event) and an artist-disjoint train/test split to produce unbiased estimates for new-artist generalization.</w:t>
+      </w:r>
+    </w:p>
+    <w:p>
+      <w:pPr>
+        <w:spacing w:after="80" w:before="80"/>
+        <w:jc w:val="left"/>
+      </w:pPr>
+      <w:r>
+        <w:rPr>
+          <w:rFonts w:ascii="Arial" w:cs="Arial" w:eastAsia="Arial" w:hAnsi="Arial"/>
+          <w:b w:val="false"/>
+          <w:bCs w:val="false"/>
+          <w:i w:val="false"/>
+          <w:iCs w:val="false"/>
+          <w:sz w:val="20"/>
+          <w:szCs w:val="20"/>
+        </w:rPr>
+        <w:t xml:space="preserve">Additional limitations: Spotify's Developer Mode rate limit prevented full API-based artist feature collection for non-charted tracks, requiring a workaround that introduces data source asymmetry between charted and non-charted artists (see Section 2.1). Five artist demographic features were excluded due to coverage below 1% of the non-charted universe. The two Spotify popularity metrics are highly collinear (VIF &gt; 14), making individual coefficient signs unreliable. Lyric sentiment covers only 40.1% of charted tracks. Four covariates fail the Schoenfeld proportional hazards test. All reported associations are observational and should not be interpreted causally.</w:t>
       </w:r>
     </w:p>
     <w:p>
@@ -4509,7 +4563,7 @@
           <w:sz w:val="20"/>
           <w:szCs w:val="20"/>
         </w:rPr>
-        <w:t xml:space="preserve">Three analyses were scoped and designed but not completed within the project timeline. (1) Librosa spectral feature extraction: pipeline scripts were written to fetch 30-second Spotify preview URLs (modal_preview_urls.py) and extract 13 MFCCs, spectral centroid, and rolloff per track (modal_librosa_extract.py), scoped to the 2,157 charted tracks. Execution was blocked by the same Spotify Developer Mode rate limit that constrained artist scraping; the preview URL fetch requires individual API calls within the same rate-limited quota. Had these features been collected, they would have enabled a direct test of whether low-level timbre and production quality predict chart success independently of Spotify's pre-computed audio features, which are coarser proprietary aggregates. The pipeline remains ready to execute once the rate limit resets. (2) Temporal robustness validation: the current holdout is a random stratified 80/20 split across the full 1958 to 2024 period. A methodologically stronger test would train on pre-2020 tracks and evaluate on 2020 to 2024 tracks, assessing whether the model generalizes to contemporary releases rather than interpolating within the historical distribution. Given the decade_idx finding (HR = 0.514 per decade), the structural streaming-era shift in chart dynamics creates a real risk that performance on current releases differs from the historical held-out accuracy, and this check was not completed. (3) Spotify popularity classification (RQ3): an original research question asked whether audio and artist features can predict whether a track reaches Spotify popularity score &gt;= 80, a platform-level threshold distinct from Billboard charting. The outcome variable is defined and available in the dataset but was deprioritized in favor of deeper treatment of the two Billboard-based research questions.</w:t>
+        <w:t xml:space="preserve">Three analyses were scoped and designed but not completed within the project timeline. (1) Librosa spectral feature extraction: pipeline scripts were written to fetch 30-second Spotify preview URLs (modal_preview_urls.py) and extract 13 MFCCs, spectral centroid, and rolloff per track (modal_librosa_extract.py), scoped to the 2,157 charted tracks. Execution was blocked by the same Spotify Developer Mode rate limit that constrained artist scraping. Had these features been collected, they would have enabled a direct test of whether low-level timbre and production quality predict chart success independently of Spotify's pre-computed audio features. (2) Temporal robustness validation: a methodologically stronger holdout would train on pre-2020 tracks and evaluate on 2020 to 2024 tracks, directly testing whether the model generalizes to the contemporary streaming era or merely interpolates within the historical distribution. Given the streaming-era structural shift identified in H3, this check is particularly important and was not completed. (3) Spotify popularity classification (RQ3): an original research question — whether audio and artist features predict whether a track reaches Spotify popularity score &gt;= 80 — was deprioritized in favor of deeper treatment of the Billboard-based questions. The outcome variable is defined and available in the dataset.</w:t>
       </w:r>
     </w:p>
     <w:p>
@@ -4539,7 +4593,7 @@
           <w:sz w:val="20"/>
           <w:szCs w:val="20"/>
         </w:rPr>
-        <w:t xml:space="preserve">The most tractable near-term extension is completing the Librosa spectral extraction pipeline, which requires only resolving the API rate limit constraint. Incorporating first-week streaming velocity and social media engagement signals (TikTok video count, Shazam search volume, Spotify first-week streams) would likely provide the largest incremental predictive lift, as these signals capture demand momentum before chart aggregation occurs. For the longevity model, a time-varying covariate extension of Cox PH or an accelerated failure time (AFT) model with a Weibull baseline would resolve the four Schoenfeld violations; a temporal train/test split (pre-2020 train, 2020 to 2024 test) would directly address the robustness gap. The Spotify popularity classification (RQ3) is a natural extension using the same model architecture on an already-constructed outcome variable. On the feature side, resolving the artist_peak_popularity / artist_popularity_api collinearity via principal component reduction or LASSO penalization would improve interpretability, and a dataset with universe-level artist demographic coverage would enable the gender, age, and genre-classification analysis that sparse coverage precluded here.</w:t>
+        <w:t xml:space="preserve">Addressing the temporal leakage issue is the most important methodological improvement for a follow-on study. This requires two changes: constructing point-in-time artist features indexed to each track's chart_entry_date (or release date), and using an artist-disjoint split where no artist appearing in the training set has tracks in the test set. Both changes would likely reduce reported AUC figures but would yield more honest estimates of prospective generalization performance. The most tractable data extension is completing the Librosa spectral extraction pipeline once the API rate limit resets. Incorporating first-week streaming velocity and social media signals (TikTok video count, Shazam search volume) would address the most commercially relevant predictors of contemporary chart trajectory. For the longevity model, a time-varying covariate extension of Cox PH or an accelerated failure time (AFT) model would resolve the four Schoenfeld violations, and a temporal train/test split would address the robustness gap. The Spotify popularity classification (RQ3) and artist demographic analysis remain natural extensions given the existing dataset infrastructure.</w:t>
       </w:r>
     </w:p>
     <w:p>

</xml_diff>